<commit_message>
Add Pictures for Readme
</commit_message>
<xml_diff>
--- a/My Files/BuiltPoints Readme.docx
+++ b/My Files/BuiltPoints Readme.docx
@@ -76,13 +76,7 @@
         <w:t xml:space="preserve"> </w:t>
       </w:r>
       <w:r>
-        <w:t xml:space="preserve">You can run your current mission without worrying about what’s waiting in the queue. </w:t>
-      </w:r>
-      <w:r>
-        <w:t xml:space="preserve">This is a good mod for you if you want to force time to pass between launches and are okay </w:t>
-      </w:r>
-      <w:r>
-        <w:t>with abstracting the details to get there for simpler gameplay.</w:t>
+        <w:t>You can run your current mission without worrying about what’s waiting in the queue. This is a good mod for you if you want to force time to pass between launches and are okay with abstracting the details to get there for simpler gameplay.</w:t>
       </w:r>
     </w:p>
     <w:p/>
@@ -157,7 +151,7 @@
           <w:b/>
           <w:bCs/>
         </w:rPr>
-        <w:t>Settings Explained</w:t>
+        <w:t>Screenshots</w:t>
       </w:r>
     </w:p>
     <w:p>
@@ -170,55 +164,21 @@
     </w:p>
     <w:p>
       <w:r>
-        <w:t xml:space="preserve">BuildPoints Icon: </w:t>
-      </w:r>
-      <w:r>
-        <w:rPr>
-          <w:noProof/>
-        </w:rPr>
-        <w:drawing>
-          <wp:inline distT="0" distB="0" distL="0" distR="0" wp14:anchorId="773AE8E4" wp14:editId="2A1899E6">
-            <wp:extent cx="361950" cy="361950"/>
-            <wp:effectExtent l="0" t="0" r="0" b="0"/>
-            <wp:docPr id="1646851518" name="Picture 2"/>
-            <wp:cNvGraphicFramePr>
-              <a:graphicFrameLocks xmlns:a="http://schemas.openxmlformats.org/drawingml/2006/main" noChangeAspect="1"/>
-            </wp:cNvGraphicFramePr>
-            <a:graphic xmlns:a="http://schemas.openxmlformats.org/drawingml/2006/main">
-              <a:graphicData uri="http://schemas.openxmlformats.org/drawingml/2006/picture">
-                <pic:pic xmlns:pic="http://schemas.openxmlformats.org/drawingml/2006/picture">
-                  <pic:nvPicPr>
-                    <pic:cNvPr id="1646851518" name="Picture 1646851518"/>
-                    <pic:cNvPicPr/>
-                  </pic:nvPicPr>
-                  <pic:blipFill>
-                    <a:blip r:embed="rId4">
-                      <a:extLst>
-                        <a:ext uri="{28A0092B-C50C-407E-A947-70E740481C1C}">
-                          <a14:useLocalDpi xmlns:a14="http://schemas.microsoft.com/office/drawing/2010/main" val="0"/>
-                        </a:ext>
-                      </a:extLst>
-                    </a:blip>
-                    <a:stretch>
-                      <a:fillRect/>
-                    </a:stretch>
-                  </pic:blipFill>
-                  <pic:spPr>
-                    <a:xfrm>
-                      <a:off x="0" y="0"/>
-                      <a:ext cx="361950" cy="361950"/>
-                    </a:xfrm>
-                    <a:prstGeom prst="rect">
-                      <a:avLst/>
-                    </a:prstGeom>
-                  </pic:spPr>
-                </pic:pic>
-              </a:graphicData>
-            </a:graphic>
-          </wp:inline>
-        </w:drawing>
+        <w:t>BuildPoints</w:t>
+      </w:r>
+      <w:r>
+        <w:t xml:space="preserve"> Toolbar</w:t>
+      </w:r>
+      <w:r>
+        <w:t xml:space="preserve"> Icon:</w:t>
       </w:r>
     </w:p>
+    <w:p>
+      <w:r>
+        <w:t>![alt text](https://github.com/RoastPotato13/BuildPoints/blob/master/BuildPointsIcon.png "BP Icon")</w:t>
+      </w:r>
+    </w:p>
+    <w:p/>
     <w:p/>
     <w:p>
       <w:pPr>

</xml_diff>

<commit_message>
test pushing the readme
</commit_message>
<xml_diff>
--- a/My Files/BuiltPoints Readme.docx
+++ b/My Files/BuiltPoints Readme.docx
@@ -16,6 +16,7 @@
         </w:rPr>
         <w:t xml:space="preserve">Why </w:t>
       </w:r>
+      <w:proofErr w:type="spellStart"/>
       <w:r>
         <w:rPr>
           <w:b/>
@@ -23,6 +24,7 @@
         </w:rPr>
         <w:t>BuildPoints</w:t>
       </w:r>
+      <w:proofErr w:type="spellEnd"/>
       <w:r>
         <w:rPr>
           <w:b/>
@@ -33,14 +35,27 @@
     </w:p>
     <w:p/>
     <w:p>
-      <w:r>
-        <w:t xml:space="preserve">BuildPoints is an alternative construction time </w:t>
+      <w:proofErr w:type="spellStart"/>
+      <w:r>
+        <w:t>BuildPoints</w:t>
+      </w:r>
+      <w:proofErr w:type="spellEnd"/>
+      <w:r>
+        <w:t xml:space="preserve"> is an alternative construction time </w:t>
       </w:r>
       <w:r>
         <w:t>concept</w:t>
       </w:r>
       <w:r>
-        <w:t xml:space="preserve"> to Kerbal Construction Time.</w:t>
+        <w:t xml:space="preserve"> to </w:t>
+      </w:r>
+      <w:proofErr w:type="spellStart"/>
+      <w:r>
+        <w:t>Kerbal</w:t>
+      </w:r>
+      <w:proofErr w:type="spellEnd"/>
+      <w:r>
+        <w:t xml:space="preserve"> Construction Time.</w:t>
       </w:r>
       <w:r>
         <w:t xml:space="preserve"> The goal is to provide a simpler setup, which integrates with stock systems, and doesn’t require as much micromanagement</w:t>
@@ -76,7 +91,15 @@
         <w:t xml:space="preserve"> </w:t>
       </w:r>
       <w:r>
-        <w:t>You can run your current mission without worrying about what’s waiting in the queue. This is a good mod for you if you want to force time to pass between launches and are okay with abstracting the details to get there for simpler gameplay.</w:t>
+        <w:t xml:space="preserve">You can run your current mission without worrying about what’s waiting in the queue. This is a good </w:t>
+      </w:r>
+      <w:proofErr w:type="spellStart"/>
+      <w:r>
+        <w:t>mod</w:t>
+      </w:r>
+      <w:proofErr w:type="spellEnd"/>
+      <w:r>
+        <w:t xml:space="preserve"> for you if you want to force time to pass between launches and are okay with abstracting the details to get there for simpler gameplay.</w:t>
       </w:r>
     </w:p>
     <w:p/>
@@ -104,11 +127,72 @@
       </w:pPr>
     </w:p>
     <w:p>
-      <w:r>
-        <w:t>BuildPoints works by adding an additional resource to the game called “BuildPoints” which are needed to build any new craft. You passively accrue BuildPoints over time. As long as you have enough build points at the time of your launch, everything will behave exactly the same as stock with the BuildPoints costs deducted from your total.</w:t>
-      </w:r>
-      <w:r>
-        <w:t xml:space="preserve"> I view this as your manufacturing team is working on “something” but you don’t have to decide what that “something” actually is until you</w:t>
+      <w:proofErr w:type="spellStart"/>
+      <w:r>
+        <w:t>BuildPoints</w:t>
+      </w:r>
+      <w:proofErr w:type="spellEnd"/>
+      <w:r>
+        <w:t xml:space="preserve"> works by adding an additional resource to the game called “</w:t>
+      </w:r>
+      <w:proofErr w:type="spellStart"/>
+      <w:r>
+        <w:t>BuildPoints</w:t>
+      </w:r>
+      <w:proofErr w:type="spellEnd"/>
+      <w:r>
+        <w:t xml:space="preserve">” which are needed to build any new craft. You passively accrue </w:t>
+      </w:r>
+      <w:proofErr w:type="spellStart"/>
+      <w:r>
+        <w:t>BuildPoints</w:t>
+      </w:r>
+      <w:proofErr w:type="spellEnd"/>
+      <w:r>
+        <w:t xml:space="preserve"> over time. </w:t>
+      </w:r>
+      <w:proofErr w:type="gramStart"/>
+      <w:r>
+        <w:t>As long as</w:t>
+      </w:r>
+      <w:proofErr w:type="gramEnd"/>
+      <w:r>
+        <w:t xml:space="preserve"> you have enough build points at the time of your launch, everything will behave </w:t>
+      </w:r>
+      <w:proofErr w:type="gramStart"/>
+      <w:r>
+        <w:t>exactly the same</w:t>
+      </w:r>
+      <w:proofErr w:type="gramEnd"/>
+      <w:r>
+        <w:t xml:space="preserve"> as stock with the </w:t>
+      </w:r>
+      <w:proofErr w:type="spellStart"/>
+      <w:r>
+        <w:t>BuildPoints</w:t>
+      </w:r>
+      <w:proofErr w:type="spellEnd"/>
+      <w:r>
+        <w:t xml:space="preserve"> costs deducted from your total.</w:t>
+      </w:r>
+      <w:r>
+        <w:t xml:space="preserve"> I view this as your manufacturing team is working on “something</w:t>
+      </w:r>
+      <w:proofErr w:type="gramStart"/>
+      <w:r>
+        <w:t>”</w:t>
+      </w:r>
+      <w:proofErr w:type="gramEnd"/>
+      <w:r>
+        <w:t xml:space="preserve"> but you don’t have to decide what that “something” </w:t>
+      </w:r>
+      <w:proofErr w:type="gramStart"/>
+      <w:r>
+        <w:t>actually is</w:t>
+      </w:r>
+      <w:proofErr w:type="gramEnd"/>
+      <w:r>
+        <w:t xml:space="preserve"> until you</w:t>
       </w:r>
       <w:r>
         <w:t xml:space="preserve"> are ready to</w:t>
@@ -120,8 +204,17 @@
         <w:t xml:space="preserve">A bit less realistic, but more flexible to use. </w:t>
       </w:r>
       <w:r>
-        <w:t xml:space="preserve">If you do not have enough BuildPoints available, a pop-up will allow you to </w:t>
-      </w:r>
+        <w:t xml:space="preserve">If you do not have enough </w:t>
+      </w:r>
+      <w:proofErr w:type="spellStart"/>
+      <w:r>
+        <w:t>BuildPoints</w:t>
+      </w:r>
+      <w:proofErr w:type="spellEnd"/>
+      <w:r>
+        <w:t xml:space="preserve"> available, a pop-up will allow you to </w:t>
+      </w:r>
+      <w:proofErr w:type="gramStart"/>
       <w:r>
         <w:t>automatically</w:t>
       </w:r>
@@ -129,13 +222,25 @@
         <w:t xml:space="preserve"> </w:t>
       </w:r>
       <w:r>
-        <w:t xml:space="preserve">time </w:t>
+        <w:t>time</w:t>
+      </w:r>
+      <w:proofErr w:type="gramEnd"/>
+      <w:r>
+        <w:t xml:space="preserve"> </w:t>
       </w:r>
       <w:r>
         <w:t>warp until you do.</w:t>
       </w:r>
       <w:r>
-        <w:t xml:space="preserve"> The settings are fairly flexible for you to come up with the exact setup you prefer.</w:t>
+        <w:t xml:space="preserve"> The settings are </w:t>
+      </w:r>
+      <w:proofErr w:type="gramStart"/>
+      <w:r>
+        <w:t>fairly flexible</w:t>
+      </w:r>
+      <w:proofErr w:type="gramEnd"/>
+      <w:r>
+        <w:t xml:space="preserve"> for you to come up with the exact setup you prefer.</w:t>
       </w:r>
     </w:p>
     <w:p/>
@@ -163,21 +268,197 @@
       </w:pPr>
     </w:p>
     <w:p>
+      <w:proofErr w:type="spellStart"/>
       <w:r>
         <w:t>BuildPoints</w:t>
       </w:r>
-      <w:r>
-        <w:t xml:space="preserve"> Toolbar</w:t>
-      </w:r>
-      <w:r>
-        <w:t xml:space="preserve"> Icon:</w:t>
-      </w:r>
-    </w:p>
-    <w:p>
-      <w:r>
-        <w:t>![alt text](https://github.com/RoastPotato13/BuildPoints/blob/master/BuildPointsIcon.png "BP Icon")</w:t>
-      </w:r>
-    </w:p>
+      <w:proofErr w:type="spellEnd"/>
+      <w:r>
+        <w:t xml:space="preserve"> Toolbar Icon:</w:t>
+      </w:r>
+    </w:p>
+    <w:p>
+      <w:proofErr w:type="gramStart"/>
+      <w:r>
+        <w:t>![</w:t>
+      </w:r>
+      <w:proofErr w:type="gramEnd"/>
+      <w:r>
+        <w:t xml:space="preserve">alt </w:t>
+      </w:r>
+      <w:proofErr w:type="gramStart"/>
+      <w:r>
+        <w:t>text](</w:t>
+      </w:r>
+      <w:proofErr w:type="gramEnd"/>
+      <w:r>
+        <w:t>https://github.com/RoastPotato13/BuildPoints/blob/master/GameData/BuildPoints/BuildPointsIcon.png "BP Icon")</w:t>
+      </w:r>
+    </w:p>
+    <w:p/>
+    <w:p>
+      <w:r>
+        <w:t>Space Center Build Points Display: &lt;</w:t>
+      </w:r>
+      <w:proofErr w:type="spellStart"/>
+      <w:r>
+        <w:t>br</w:t>
+      </w:r>
+      <w:proofErr w:type="spellEnd"/>
+      <w:r>
+        <w:t>&gt;</w:t>
+      </w:r>
+    </w:p>
+    <w:p>
+      <w:proofErr w:type="gramStart"/>
+      <w:r>
+        <w:t>![</w:t>
+      </w:r>
+      <w:proofErr w:type="gramEnd"/>
+      <w:r>
+        <w:t xml:space="preserve">alt </w:t>
+      </w:r>
+      <w:proofErr w:type="gramStart"/>
+      <w:r>
+        <w:t>text](</w:t>
+      </w:r>
+      <w:proofErr w:type="gramEnd"/>
+      <w:r>
+        <w:t>https://github.com/RoastPotato13/BuildPoints/blob/master/My%20Files/SpaceCenter_BPDisplay.png "BP Display")</w:t>
+      </w:r>
+    </w:p>
+    <w:p/>
+    <w:p>
+      <w:r>
+        <w:t>Space Center Settings Tab: &lt;</w:t>
+      </w:r>
+      <w:proofErr w:type="spellStart"/>
+      <w:r>
+        <w:t>br</w:t>
+      </w:r>
+      <w:proofErr w:type="spellEnd"/>
+      <w:r>
+        <w:t>&gt;</w:t>
+      </w:r>
+    </w:p>
+    <w:p>
+      <w:proofErr w:type="gramStart"/>
+      <w:r>
+        <w:t>![</w:t>
+      </w:r>
+      <w:proofErr w:type="gramEnd"/>
+      <w:r>
+        <w:t xml:space="preserve">alt </w:t>
+      </w:r>
+      <w:proofErr w:type="gramStart"/>
+      <w:r>
+        <w:t>text](</w:t>
+      </w:r>
+      <w:proofErr w:type="gramEnd"/>
+      <w:r>
+        <w:t>https://github.com/RoastPotato13/BuildPoints/blob/master/My%20Files/SpaceCenter_Settings.png "Settings")</w:t>
+      </w:r>
+    </w:p>
+    <w:p/>
+    <w:p>
+      <w:r>
+        <w:t>Space Center Main Tab: &lt;</w:t>
+      </w:r>
+      <w:proofErr w:type="spellStart"/>
+      <w:r>
+        <w:t>br</w:t>
+      </w:r>
+      <w:proofErr w:type="spellEnd"/>
+      <w:r>
+        <w:t>&gt;</w:t>
+      </w:r>
+    </w:p>
+    <w:p>
+      <w:proofErr w:type="gramStart"/>
+      <w:r>
+        <w:t>![</w:t>
+      </w:r>
+      <w:proofErr w:type="gramEnd"/>
+      <w:r>
+        <w:t xml:space="preserve">alt </w:t>
+      </w:r>
+      <w:proofErr w:type="gramStart"/>
+      <w:r>
+        <w:t>text](</w:t>
+      </w:r>
+      <w:proofErr w:type="gramEnd"/>
+      <w:r>
+        <w:t>https://github.com/RoastPotato13/BuildPoints/blob/master/My%20Files/SpaceCenter_BuildPoint.png "Main Menu")</w:t>
+      </w:r>
+    </w:p>
+    <w:p/>
+    <w:p>
+      <w:r>
+        <w:t>VAB Calculator: &lt;</w:t>
+      </w:r>
+      <w:proofErr w:type="spellStart"/>
+      <w:r>
+        <w:t>br</w:t>
+      </w:r>
+      <w:proofErr w:type="spellEnd"/>
+      <w:r>
+        <w:t>&gt;</w:t>
+      </w:r>
+    </w:p>
+    <w:p>
+      <w:proofErr w:type="gramStart"/>
+      <w:r>
+        <w:t>![</w:t>
+      </w:r>
+      <w:proofErr w:type="gramEnd"/>
+      <w:r>
+        <w:t xml:space="preserve">alt </w:t>
+      </w:r>
+      <w:proofErr w:type="gramStart"/>
+      <w:r>
+        <w:t>text](</w:t>
+      </w:r>
+      <w:proofErr w:type="gramEnd"/>
+      <w:r>
+        <w:t>https://github.com/RoastPotato13/BuildPoints/blob/master/My%20Files/VAB.png "VAB Calculator")</w:t>
+      </w:r>
+    </w:p>
+    <w:p/>
+    <w:p>
+      <w:r>
+        <w:t>VAB Auto Warp Function &lt;</w:t>
+      </w:r>
+      <w:proofErr w:type="spellStart"/>
+      <w:r>
+        <w:t>br</w:t>
+      </w:r>
+      <w:proofErr w:type="spellEnd"/>
+      <w:r>
+        <w:t>&gt;</w:t>
+      </w:r>
+    </w:p>
+    <w:p>
+      <w:proofErr w:type="gramStart"/>
+      <w:r>
+        <w:lastRenderedPageBreak/>
+        <w:t>![</w:t>
+      </w:r>
+      <w:proofErr w:type="gramEnd"/>
+      <w:r>
+        <w:t xml:space="preserve">alt </w:t>
+      </w:r>
+      <w:proofErr w:type="gramStart"/>
+      <w:r>
+        <w:t>text](</w:t>
+      </w:r>
+      <w:proofErr w:type="gramEnd"/>
+      <w:r>
+        <w:t>https://github.com/RoastPotato13/BuildPoints/blob/master/My%20Files/VAB_AutoWarp.png "Auto Warp")</w:t>
+      </w:r>
+    </w:p>
+    <w:p/>
+    <w:p/>
+    <w:p/>
     <w:p/>
     <w:p/>
     <w:p>
@@ -1110,6 +1391,29 @@
       <w:spacing w:val="5"/>
     </w:rPr>
   </w:style>
+  <w:style w:type="character" w:styleId="Hyperlink">
+    <w:name w:val="Hyperlink"/>
+    <w:basedOn w:val="DefaultParagraphFont"/>
+    <w:uiPriority w:val="99"/>
+    <w:unhideWhenUsed/>
+    <w:rsid w:val="00C8223E"/>
+    <w:rPr>
+      <w:color w:val="467886" w:themeColor="hyperlink"/>
+      <w:u w:val="single"/>
+    </w:rPr>
+  </w:style>
+  <w:style w:type="character" w:styleId="UnresolvedMention">
+    <w:name w:val="Unresolved Mention"/>
+    <w:basedOn w:val="DefaultParagraphFont"/>
+    <w:uiPriority w:val="99"/>
+    <w:semiHidden/>
+    <w:unhideWhenUsed/>
+    <w:rsid w:val="00C8223E"/>
+    <w:rPr>
+      <w:color w:val="605E5C"/>
+      <w:shd w:val="clear" w:color="auto" w:fill="E1DFDD"/>
+    </w:rPr>
+  </w:style>
 </w:styles>
 </file>
 

</xml_diff>

<commit_message>
Last Readme For Now?
</commit_message>
<xml_diff>
--- a/My Files/BuiltPoints Readme.docx
+++ b/My Files/BuiltPoints Readme.docx
@@ -281,6 +281,37 @@
     </w:p>
     <w:p/>
     <w:p/>
+    <w:p>
+      <w:pPr>
+        <w:rPr>
+          <w:b/>
+          <w:bCs/>
+        </w:rPr>
+      </w:pPr>
+      <w:r>
+        <w:rPr>
+          <w:b/>
+          <w:bCs/>
+        </w:rPr>
+        <w:t>Notes</w:t>
+      </w:r>
+    </w:p>
+    <w:p/>
+    <w:p>
+      <w:r>
+        <w:t>-This release should be stable to play. I am going to be testing for edge cases and to refine the settings I use. Feel free to leave feedback/issues you run into!</w:t>
+      </w:r>
+    </w:p>
+    <w:p>
+      <w:r>
+        <w:t>-This is my first mod, so hopefully there aren’t too many kinks.</w:t>
+      </w:r>
+    </w:p>
+    <w:p>
+      <w:r>
+        <w:t>-I did use Claude to help write the code.</w:t>
+      </w:r>
+    </w:p>
     <w:p/>
     <w:p>
       <w:pPr>

</xml_diff>